<commit_message>
Cuestionario descargable y retirada de la prueba de conocimientos
El cuestionario se entrega en papel o se vuelca en un formulario, así
que necesita versión Word. El .docx lleva sólo los bloques del
alumnado: el documento marca con comentarios qué tramos se exportan, y
en su lugar del encabezado metodológico va una explicación en su
idioma de que es anónimo, voluntario y no se califica.

La prueba de conocimientos deja de ser un instrumento compartido. Cada
docente puede usar la que estime oportuna; se mantienen las dos únicas
indicaciones que afectan a la comparabilidad: aplicarla antes y
después, y no publicar sus ítems durante la intervención.

Co-Authored-By: Claude Opus 5 <noreply@anthropic.com>
</commit_message>
<xml_diff>
--- a/descargas/ficha-calibracion.docx
+++ b/descargas/ficha-calibracion.docx
@@ -31,6 +31,30 @@
       </w:r>
       <w:r>
         <w:t xml:space="preserve">el marco común; la ficha recoge en qué se diferencia el énfasis de cada una.</w:t>
+      </w:r>
+    </w:p>
+    <w:p>
+      <w:pPr>
+        <w:pStyle w:val="FirstParagraph"/>
+      </w:pPr>
+      <w:r>
+        <w:rPr>
+          <w:b/>
+          <w:bCs/>
+        </w:rPr>
+        <w:t xml:space="preserve">[Descargar en Word]({{ '/descargas/ficha-calibracion.docx' | relative_url }})</w:t>
+      </w:r>
+      <w:r>
+        <w:t xml:space="preserve"> </w:t>
+      </w:r>
+      <w:r>
+        <w:t xml:space="preserve">para</w:t>
+      </w:r>
+      <w:r>
+        <w:t xml:space="preserve"> </w:t>
+      </w:r>
+      <w:r>
+        <w:t xml:space="preserve">rellenarla a mano. Esta página es la misma ficha en pantalla.</w:t>
       </w:r>
     </w:p>
     <w:bookmarkStart w:id="9" w:name="identificación"/>

</xml_diff>

<commit_message>
Las guías del repositorio dejan de usar Liquid y front matter
Al excluirlas del sitio, GitHub las muestra en crudo: los enlaces de
descarga aparecían como {{ ... relative_url }} y el front matter como
una tabla al principio. Los enlaces pasan a URL absoluta del sitio
publicado y se retira el front matter, que ya no cumplía ninguna
función.

Co-Authored-By: Claude Opus 5 <noreply@anthropic.com>
</commit_message>
<xml_diff>
--- a/descargas/ficha-calibracion.docx
+++ b/descargas/ficha-calibracion.docx
@@ -10,7 +10,7 @@
         <w:t xml:space="preserve">Ficha de calibración disciplinar</w:t>
       </w:r>
     </w:p>
-    <w:bookmarkStart w:id="15" w:name="ficha-de-calibración-disciplinar"/>
+    <w:bookmarkStart w:id="16" w:name="ficha-de-calibración-disciplinar"/>
     <w:p>
       <w:pPr>
         <w:pStyle w:val="Heading1"/>
@@ -37,13 +37,16 @@
       <w:pPr>
         <w:pStyle w:val="FirstParagraph"/>
       </w:pPr>
-      <w:r>
-        <w:rPr>
-          <w:b/>
-          <w:bCs/>
-        </w:rPr>
-        <w:t xml:space="preserve">[Descargar en Word]({{ '/descargas/ficha-calibracion.docx' | relative_url }})</w:t>
-      </w:r>
+      <w:hyperlink r:id="rId9">
+        <w:r>
+          <w:rPr>
+            <w:rStyle w:val="Hyperlink"/>
+            <w:b/>
+            <w:bCs/>
+          </w:rPr>
+          <w:t xml:space="preserve">Descargar en Word</w:t>
+        </w:r>
+      </w:hyperlink>
       <w:r>
         <w:t xml:space="preserve"> </w:t>
       </w:r>
@@ -57,7 +60,7 @@
         <w:t xml:space="preserve">rellenarla a mano. Esta página es la misma ficha en pantalla.</w:t>
       </w:r>
     </w:p>
-    <w:bookmarkStart w:id="9" w:name="identificación"/>
+    <w:bookmarkStart w:id="10" w:name="identificación"/>
     <w:p>
       <w:pPr>
         <w:pStyle w:val="Heading2"/>
@@ -248,8 +251,8 @@
         </w:tc>
       </w:tr>
     </w:tbl>
-    <w:bookmarkEnd w:id="9"/>
-    <w:bookmarkStart w:id="10" w:name="peso-de-las-cuatro-dimensiones"/>
+    <w:bookmarkEnd w:id="10"/>
+    <w:bookmarkStart w:id="11" w:name="peso-de-las-cuatro-dimensiones"/>
     <w:p>
       <w:pPr>
         <w:pStyle w:val="Heading2"/>
@@ -438,8 +441,8 @@
         </w:tc>
       </w:tr>
     </w:tbl>
-    <w:bookmarkEnd w:id="10"/>
-    <w:bookmarkStart w:id="11" w:name="X9613b1e5f80a667396212567711c3cdad1fb6be"/>
+    <w:bookmarkEnd w:id="11"/>
+    <w:bookmarkStart w:id="12" w:name="X9613b1e5f80a667396212567711c3cdad1fb6be"/>
     <w:p>
       <w:pPr>
         <w:pStyle w:val="Heading2"/>
@@ -544,8 +547,8 @@
         </w:tc>
       </w:tr>
     </w:tbl>
-    <w:bookmarkEnd w:id="11"/>
-    <w:bookmarkStart w:id="12" w:name="actividades-previstas"/>
+    <w:bookmarkEnd w:id="12"/>
+    <w:bookmarkStart w:id="13" w:name="actividades-previstas"/>
     <w:p>
       <w:pPr>
         <w:pStyle w:val="Heading2"/>
@@ -650,8 +653,8 @@
         </w:tc>
       </w:tr>
     </w:tbl>
-    <w:bookmarkEnd w:id="12"/>
-    <w:bookmarkStart w:id="14" w:name="medición"/>
+    <w:bookmarkEnd w:id="13"/>
+    <w:bookmarkStart w:id="15" w:name="medición"/>
     <w:p>
       <w:pPr>
         <w:pStyle w:val="Heading2"/>
@@ -743,7 +746,7 @@
       <w:r>
         <w:t xml:space="preserve"> </w:t>
       </w:r>
-      <w:hyperlink r:id="rId13">
+      <w:hyperlink r:id="rId14">
         <w:r>
           <w:rPr>
             <w:rStyle w:val="Hyperlink"/>
@@ -752,8 +755,8 @@
         </w:r>
       </w:hyperlink>
     </w:p>
-    <w:bookmarkEnd w:id="14"/>
     <w:bookmarkEnd w:id="15"/>
+    <w:bookmarkEnd w:id="16"/>
     <w:sectPr>
       <w:footnotePr>
         <w:numRestart w:val="eachSect"/>

</xml_diff>